<commit_message>
unit tests extra notes
</commit_message>
<xml_diff>
--- a/unit test.docx
+++ b/unit test.docx
@@ -5177,31 +5177,7 @@
         <w:rPr>
           <w:rFonts w:ascii="Lucida Console" w:hAnsi="Lucida Console"/>
         </w:rPr>
-        <w:t>mockMvc.perform(MockMvcRequestBuilders.get(“/endpoint</w:t>
-      </w:r>
-      <w:r>
-        <w:rPr>
-          <w:rFonts w:ascii="Lucida Console" w:hAnsi="Lucida Console"/>
-        </w:rPr>
-        <w:t>/{arg}</w:t>
-      </w:r>
-      <w:r>
-        <w:rPr>
-          <w:rFonts w:ascii="Lucida Console" w:hAnsi="Lucida Console"/>
-        </w:rPr>
-        <w:t>”</w:t>
-      </w:r>
-      <w:r>
-        <w:rPr>
-          <w:rFonts w:ascii="Lucida Console" w:hAnsi="Lucida Console"/>
-        </w:rPr>
-        <w:t>, arg</w:t>
-      </w:r>
-      <w:r>
-        <w:rPr>
-          <w:rFonts w:ascii="Lucida Console" w:hAnsi="Lucida Console"/>
-        </w:rPr>
-        <w:t>))</w:t>
+        <w:t>mockMvc.perform(MockMvcRequestBuilders.get(“/endpoint/{arg}”, arg))</w:t>
       </w:r>
     </w:p>
     <w:p>
@@ -5646,6 +5622,494 @@
           <w:rFonts w:ascii="Lucida Console" w:hAnsi="Lucida Console"/>
         </w:rPr>
         <w:t>(@RequestParam)</w:t>
+      </w:r>
+    </w:p>
+    <w:p>
+      <w:pPr>
+        <w:rPr>
+          <w:rFonts w:ascii="Lucida Console" w:hAnsi="Lucida Console"/>
+        </w:rPr>
+      </w:pPr>
+    </w:p>
+    <w:p>
+      <w:pPr>
+        <w:rPr>
+          <w:rFonts w:ascii="Lucida Console" w:hAnsi="Lucida Console"/>
+        </w:rPr>
+      </w:pPr>
+    </w:p>
+    <w:p>
+      <w:pPr>
+        <w:rPr>
+          <w:rFonts w:ascii="Lucida Console" w:hAnsi="Lucida Console"/>
+          <w:b/>
+          <w:bCs/>
+        </w:rPr>
+      </w:pPr>
+      <w:r>
+        <w:rPr>
+          <w:rFonts w:ascii="Lucida Console" w:hAnsi="Lucida Console"/>
+          <w:b/>
+          <w:bCs/>
+        </w:rPr>
+        <w:t>...</w:t>
+      </w:r>
+    </w:p>
+    <w:p>
+      <w:pPr>
+        <w:rPr>
+          <w:rFonts w:ascii="Lucida Console" w:hAnsi="Lucida Console"/>
+          <w:b/>
+          <w:bCs/>
+        </w:rPr>
+      </w:pPr>
+      <w:r>
+        <w:rPr>
+          <w:rFonts w:ascii="Lucida Console" w:hAnsi="Lucida Console"/>
+          <w:b/>
+          <w:bCs/>
+        </w:rPr>
+        <w:br w:type="page"/>
+      </w:r>
+    </w:p>
+    <w:p>
+      <w:pPr>
+        <w:rPr>
+          <w:rFonts w:ascii="Lucida Console" w:hAnsi="Lucida Console"/>
+          <w:b/>
+          <w:bCs/>
+        </w:rPr>
+      </w:pPr>
+      <w:r>
+        <w:rPr>
+          <w:rFonts w:ascii="Lucida Console" w:hAnsi="Lucida Console"/>
+          <w:b/>
+          <w:bCs/>
+        </w:rPr>
+        <w:lastRenderedPageBreak/>
+        <w:t>.Mocking Non-Bean Static Functions</w:t>
+      </w:r>
+    </w:p>
+    <w:p>
+      <w:pPr>
+        <w:rPr>
+          <w:rFonts w:ascii="Lucida Console" w:hAnsi="Lucida Console"/>
+          <w:b/>
+          <w:bCs/>
+        </w:rPr>
+      </w:pPr>
+    </w:p>
+    <w:p>
+      <w:pPr>
+        <w:rPr>
+          <w:rFonts w:ascii="Lucida Console" w:hAnsi="Lucida Console"/>
+        </w:rPr>
+      </w:pPr>
+      <w:r>
+        <w:rPr>
+          <w:rFonts w:ascii="Lucida Console" w:hAnsi="Lucida Console"/>
+        </w:rPr>
+        <w:t>//StaticUtils is the class to be mocked</w:t>
+      </w:r>
+    </w:p>
+    <w:p>
+      <w:pPr>
+        <w:rPr>
+          <w:rFonts w:ascii="Lucida Console" w:hAnsi="Lucida Console"/>
+        </w:rPr>
+      </w:pPr>
+      <w:r>
+        <w:rPr>
+          <w:rFonts w:ascii="Lucida Console" w:hAnsi="Lucida Console"/>
+        </w:rPr>
+        <w:t>MockedStatic&lt;StaticUtils&gt; mockedStatic;</w:t>
+      </w:r>
+    </w:p>
+    <w:p>
+      <w:pPr>
+        <w:rPr>
+          <w:rFonts w:ascii="Lucida Console" w:hAnsi="Lucida Console"/>
+          <w:b/>
+          <w:bCs/>
+        </w:rPr>
+      </w:pPr>
+    </w:p>
+    <w:p>
+      <w:pPr>
+        <w:rPr>
+          <w:rFonts w:ascii="Lucida Console" w:hAnsi="Lucida Console"/>
+        </w:rPr>
+      </w:pPr>
+      <w:r>
+        <w:rPr>
+          <w:rFonts w:ascii="Lucida Console" w:hAnsi="Lucida Console"/>
+        </w:rPr>
+        <w:t xml:space="preserve">    @BeforeEach</w:t>
+      </w:r>
+    </w:p>
+    <w:p>
+      <w:pPr>
+        <w:rPr>
+          <w:rFonts w:ascii="Lucida Console" w:hAnsi="Lucida Console"/>
+        </w:rPr>
+      </w:pPr>
+      <w:r>
+        <w:rPr>
+          <w:rFonts w:ascii="Lucida Console" w:hAnsi="Lucida Console"/>
+        </w:rPr>
+        <w:t xml:space="preserve">    void setUp() {</w:t>
+      </w:r>
+    </w:p>
+    <w:p>
+      <w:pPr>
+        <w:rPr>
+          <w:rFonts w:ascii="Lucida Console" w:hAnsi="Lucida Console"/>
+        </w:rPr>
+      </w:pPr>
+      <w:r>
+        <w:rPr>
+          <w:rFonts w:ascii="Lucida Console" w:hAnsi="Lucida Console"/>
+        </w:rPr>
+        <w:t xml:space="preserve">        mockedStatic = mockStatic(StaticUtils.class);</w:t>
+      </w:r>
+    </w:p>
+    <w:p>
+      <w:pPr>
+        <w:rPr>
+          <w:rFonts w:ascii="Lucida Console" w:hAnsi="Lucida Console"/>
+        </w:rPr>
+      </w:pPr>
+      <w:r>
+        <w:rPr>
+          <w:rFonts w:ascii="Lucida Console" w:hAnsi="Lucida Console"/>
+        </w:rPr>
+        <w:t xml:space="preserve">    }</w:t>
+      </w:r>
+    </w:p>
+    <w:p>
+      <w:pPr>
+        <w:rPr>
+          <w:rFonts w:ascii="Lucida Console" w:hAnsi="Lucida Console"/>
+        </w:rPr>
+      </w:pPr>
+    </w:p>
+    <w:p>
+      <w:pPr>
+        <w:rPr>
+          <w:rFonts w:ascii="Lucida Console" w:hAnsi="Lucida Console"/>
+        </w:rPr>
+      </w:pPr>
+      <w:r>
+        <w:rPr>
+          <w:rFonts w:ascii="Lucida Console" w:hAnsi="Lucida Console"/>
+        </w:rPr>
+        <w:t xml:space="preserve">    @AfterEach</w:t>
+      </w:r>
+    </w:p>
+    <w:p>
+      <w:pPr>
+        <w:rPr>
+          <w:rFonts w:ascii="Lucida Console" w:hAnsi="Lucida Console"/>
+        </w:rPr>
+      </w:pPr>
+      <w:r>
+        <w:rPr>
+          <w:rFonts w:ascii="Lucida Console" w:hAnsi="Lucida Console"/>
+        </w:rPr>
+        <w:t xml:space="preserve">    void tearDown() {</w:t>
+      </w:r>
+    </w:p>
+    <w:p>
+      <w:pPr>
+        <w:rPr>
+          <w:rFonts w:ascii="Lucida Console" w:hAnsi="Lucida Console"/>
+        </w:rPr>
+      </w:pPr>
+      <w:r>
+        <w:rPr>
+          <w:rFonts w:ascii="Lucida Console" w:hAnsi="Lucida Console"/>
+        </w:rPr>
+        <w:t xml:space="preserve">        mockedStatic.close();</w:t>
+      </w:r>
+    </w:p>
+    <w:p>
+      <w:pPr>
+        <w:rPr>
+          <w:rFonts w:ascii="Lucida Console" w:hAnsi="Lucida Console"/>
+        </w:rPr>
+      </w:pPr>
+      <w:r>
+        <w:rPr>
+          <w:rFonts w:ascii="Lucida Console" w:hAnsi="Lucida Console"/>
+        </w:rPr>
+        <w:t xml:space="preserve">    }</w:t>
+      </w:r>
+    </w:p>
+    <w:p>
+      <w:pPr>
+        <w:rPr>
+          <w:rFonts w:ascii="Lucida Console" w:hAnsi="Lucida Console"/>
+        </w:rPr>
+      </w:pPr>
+      <w:r>
+        <w:rPr>
+          <w:rFonts w:ascii="Lucida Console" w:hAnsi="Lucida Console"/>
+        </w:rPr>
+        <w:t xml:space="preserve">//before each @Test function, static mock should be initatiated and after each it should be closed, otherwise it will behave unexpectedly. </w:t>
+      </w:r>
+    </w:p>
+    <w:p>
+      <w:pPr>
+        <w:rPr>
+          <w:rFonts w:ascii="Lucida Console" w:hAnsi="Lucida Console"/>
+        </w:rPr>
+      </w:pPr>
+    </w:p>
+    <w:p>
+      <w:pPr>
+        <w:rPr>
+          <w:rFonts w:ascii="Lucida Console" w:hAnsi="Lucida Console"/>
+        </w:rPr>
+      </w:pPr>
+      <w:r>
+        <w:rPr>
+          <w:rFonts w:ascii="Lucida Console" w:hAnsi="Lucida Console"/>
+        </w:rPr>
+        <w:t>then static function call can be mocked as follows:</w:t>
+      </w:r>
+    </w:p>
+    <w:p>
+      <w:pPr>
+        <w:rPr>
+          <w:rFonts w:ascii="Lucida Console" w:hAnsi="Lucida Console"/>
+        </w:rPr>
+      </w:pPr>
+      <w:r>
+        <w:rPr>
+          <w:rFonts w:ascii="Lucida Console" w:hAnsi="Lucida Console"/>
+        </w:rPr>
+        <w:t>mockedStatic.when(() -&gt; StaticUtils.doThing()).thenReturn("mocked");</w:t>
+      </w:r>
+    </w:p>
+    <w:p>
+      <w:pPr>
+        <w:rPr>
+          <w:rFonts w:ascii="Lucida Console" w:hAnsi="Lucida Console"/>
+        </w:rPr>
+      </w:pPr>
+    </w:p>
+    <w:p>
+      <w:pPr>
+        <w:rPr>
+          <w:rFonts w:ascii="Lucida Console" w:hAnsi="Lucida Console"/>
+        </w:rPr>
+      </w:pPr>
+      <w:r>
+        <w:rPr>
+          <w:rFonts w:ascii="Lucida Console" w:hAnsi="Lucida Console"/>
+        </w:rPr>
+        <w:t xml:space="preserve">every other static function in that class will return (0,false,null) unless CALLS_REAL_METHODS flag is set </w:t>
+      </w:r>
+    </w:p>
+    <w:p>
+      <w:pPr>
+        <w:rPr>
+          <w:rFonts w:ascii="Lucida Console" w:hAnsi="Lucida Console"/>
+        </w:rPr>
+      </w:pPr>
+      <w:r>
+        <w:rPr>
+          <w:rFonts w:ascii="Lucida Console" w:hAnsi="Lucida Console"/>
+        </w:rPr>
+        <w:t>mockStatic(MyUtils.class, CALLS_REAL_METHODS);</w:t>
+      </w:r>
+    </w:p>
+    <w:p>
+      <w:pPr>
+        <w:rPr>
+          <w:rFonts w:ascii="Lucida Console" w:hAnsi="Lucida Console"/>
+          <w:b/>
+          <w:bCs/>
+        </w:rPr>
+      </w:pPr>
+    </w:p>
+    <w:p>
+      <w:pPr>
+        <w:rPr>
+          <w:rFonts w:ascii="Lucida Console" w:hAnsi="Lucida Console"/>
+          <w:b/>
+          <w:bCs/>
+        </w:rPr>
+      </w:pPr>
+      <w:r>
+        <w:rPr>
+          <w:rFonts w:ascii="Lucida Console" w:hAnsi="Lucida Console"/>
+          <w:b/>
+          <w:bCs/>
+        </w:rPr>
+        <w:t>.ArgumentCaptor.</w:t>
+      </w:r>
+    </w:p>
+    <w:p>
+      <w:pPr>
+        <w:rPr>
+          <w:rFonts w:ascii="Lucida Console" w:hAnsi="Lucida Console"/>
+          <w:b/>
+          <w:bCs/>
+        </w:rPr>
+      </w:pPr>
+    </w:p>
+    <w:p>
+      <w:pPr>
+        <w:rPr>
+          <w:rFonts w:ascii="Lucida Console" w:hAnsi="Lucida Console"/>
+        </w:rPr>
+      </w:pPr>
+      <w:r>
+        <w:rPr>
+          <w:rFonts w:ascii="Lucida Console" w:hAnsi="Lucida Console"/>
+        </w:rPr>
+        <w:t>//argumentCaptor is set to capture parameter with type of JsonObject</w:t>
+      </w:r>
+    </w:p>
+    <w:p>
+      <w:pPr>
+        <w:rPr>
+          <w:rFonts w:ascii="Lucida Console" w:hAnsi="Lucida Console"/>
+        </w:rPr>
+      </w:pPr>
+      <w:r>
+        <w:rPr>
+          <w:rFonts w:ascii="Lucida Console" w:hAnsi="Lucida Console"/>
+        </w:rPr>
+        <w:t xml:space="preserve">    ArgumentCaptor&lt;JsonObject&gt; jsonCaptor = ArgumentCaptor.forClass(JsonObject.class);</w:t>
+      </w:r>
+    </w:p>
+    <w:p>
+      <w:pPr>
+        <w:rPr>
+          <w:rFonts w:ascii="Lucida Console" w:hAnsi="Lucida Console"/>
+        </w:rPr>
+      </w:pPr>
+    </w:p>
+    <w:p>
+      <w:pPr>
+        <w:rPr>
+          <w:rFonts w:ascii="Lucida Console" w:hAnsi="Lucida Console"/>
+        </w:rPr>
+      </w:pPr>
+    </w:p>
+    <w:p>
+      <w:pPr>
+        <w:rPr>
+          <w:rFonts w:ascii="Lucida Console" w:hAnsi="Lucida Console"/>
+        </w:rPr>
+      </w:pPr>
+      <w:r>
+        <w:rPr>
+          <w:rFonts w:ascii="Lucida Console" w:hAnsi="Lucida Console"/>
+        </w:rPr>
+        <w:t xml:space="preserve">    mockedStatic.when(() -&gt; HttpCaller.call(any(), any(), any())).thenReturn(fake);</w:t>
+      </w:r>
+    </w:p>
+    <w:p>
+      <w:pPr>
+        <w:rPr>
+          <w:rFonts w:ascii="Lucida Console" w:hAnsi="Lucida Console"/>
+        </w:rPr>
+      </w:pPr>
+    </w:p>
+    <w:p>
+      <w:pPr>
+        <w:rPr>
+          <w:rFonts w:ascii="Lucida Console" w:hAnsi="Lucida Console"/>
+        </w:rPr>
+      </w:pPr>
+      <w:r>
+        <w:rPr>
+          <w:rFonts w:ascii="Lucida Console" w:hAnsi="Lucida Console"/>
+        </w:rPr>
+        <w:t xml:space="preserve">    service.mukellefTuruSorgulaEteb(webClient, buildRequest());</w:t>
+      </w:r>
+    </w:p>
+    <w:p>
+      <w:pPr>
+        <w:rPr>
+          <w:rFonts w:ascii="Lucida Console" w:hAnsi="Lucida Console"/>
+        </w:rPr>
+      </w:pPr>
+    </w:p>
+    <w:p>
+      <w:pPr>
+        <w:rPr>
+          <w:rFonts w:ascii="Lucida Console" w:hAnsi="Lucida Console"/>
+        </w:rPr>
+      </w:pPr>
+      <w:r>
+        <w:rPr>
+          <w:rFonts w:ascii="Lucida Console" w:hAnsi="Lucida Console"/>
+        </w:rPr>
+        <w:lastRenderedPageBreak/>
+        <w:t xml:space="preserve">    mockedStatic.verify(() -&gt; HttpCaller.call(eq(webClient), jsonCaptor.capture(), eq(ServiceCallEnums.SERVICE_CALL)));</w:t>
+      </w:r>
+    </w:p>
+    <w:p>
+      <w:pPr>
+        <w:rPr>
+          <w:rFonts w:ascii="Lucida Console" w:hAnsi="Lucida Console"/>
+        </w:rPr>
+      </w:pPr>
+    </w:p>
+    <w:p>
+      <w:pPr>
+        <w:rPr>
+          <w:rFonts w:ascii="Lucida Console" w:hAnsi="Lucida Console"/>
+        </w:rPr>
+      </w:pPr>
+      <w:r>
+        <w:rPr>
+          <w:rFonts w:ascii="Lucida Console" w:hAnsi="Lucida Console"/>
+        </w:rPr>
+        <w:t xml:space="preserve">    JsonObject captured = jsonCaptor.getValue();</w:t>
+      </w:r>
+    </w:p>
+    <w:p>
+      <w:pPr>
+        <w:rPr>
+          <w:rFonts w:ascii="Lucida Console" w:hAnsi="Lucida Console"/>
+        </w:rPr>
+      </w:pPr>
+      <w:r>
+        <w:rPr>
+          <w:rFonts w:ascii="Lucida Console" w:hAnsi="Lucida Console"/>
+        </w:rPr>
+        <w:t xml:space="preserve">    assertEquals("1234567890", captured.get("vkn").getAsString());</w:t>
+      </w:r>
+    </w:p>
+    <w:p>
+      <w:pPr>
+        <w:rPr>
+          <w:rFonts w:ascii="Lucida Console" w:hAnsi="Lucida Console"/>
+        </w:rPr>
+      </w:pPr>
+      <w:r>
+        <w:rPr>
+          <w:rFonts w:ascii="Lucida Console" w:hAnsi="Lucida Console"/>
+        </w:rPr>
+        <w:t xml:space="preserve">    assertEquals("12345678901", captured.get("tckn").getAsString());</w:t>
+      </w:r>
+    </w:p>
+    <w:p>
+      <w:pPr>
+        <w:rPr>
+          <w:rFonts w:ascii="Lucida Console" w:hAnsi="Lucida Console"/>
+        </w:rPr>
+      </w:pPr>
+      <w:r>
+        <w:rPr>
+          <w:rFonts w:ascii="Lucida Console" w:hAnsi="Lucida Console"/>
+        </w:rPr>
+        <w:t xml:space="preserve">    assertEquals("KURUM01", captured.get("kullaniciKodu").getAsString());</w:t>
       </w:r>
     </w:p>
     <w:sectPr>
@@ -6061,7 +6525,6 @@
   <w:style w:type="character" w:default="1" w:styleId="VarsaylanParagrafYazTipi">
     <w:name w:val="Default Paragraph Font"/>
     <w:uiPriority w:val="1"/>
-    <w:semiHidden/>
     <w:unhideWhenUsed/>
   </w:style>
   <w:style w:type="table" w:default="1" w:styleId="NormalTablo">

</xml_diff>